<commit_message>
completed my second section move on to the R script and figures
</commit_message>
<xml_diff>
--- a/Independent-Project.docx
+++ b/Independent-Project.docx
@@ -47,7 +47,7 @@
         <w:pStyle w:val="BodyText"/>
       </w:pPr>
       <w:r>
-        <w:t xml:space="preserve">both humans and other dogs emotions. This is important for domestic dogs</w:t>
+        <w:t xml:space="preserve">both humans and other dogs’ emotions. This is important for domestic dogs</w:t>
       </w:r>
     </w:p>
     <w:p>
@@ -55,7 +55,7 @@
         <w:pStyle w:val="BodyText"/>
       </w:pPr>
       <w:r>
-        <w:t xml:space="preserve">because humans express emotions differently than canines. In this</w:t>
+        <w:t xml:space="preserve">because humans’ express emotions differently than canines. In this</w:t>
       </w:r>
     </w:p>
     <w:p>
@@ -151,7 +151,7 @@
         <w:pStyle w:val="BodyText"/>
       </w:pPr>
       <w:r>
-        <w:t xml:space="preserve">The longer a dog stares, the more it is confirmed that the dogs understands</w:t>
+        <w:t xml:space="preserve">The longer a dog stares, the more it is confirmed that the dogs understand</w:t>
       </w:r>
     </w:p>
     <w:p>
@@ -160,6 +160,293 @@
       </w:pPr>
       <w:r>
         <w:t xml:space="preserve">the emotions being shown.</w:t>
+      </w:r>
+    </w:p>
+    <w:p>
+      <w:pPr>
+        <w:pStyle w:val="BodyText"/>
+      </w:pPr>
+      <w:r>
+        <w:t xml:space="preserve">#2. Project Workflow:</w:t>
+      </w:r>
+    </w:p>
+    <w:p>
+      <w:pPr>
+        <w:numPr>
+          <w:ilvl w:val="0"/>
+          <w:numId w:val="1001"/>
+        </w:numPr>
+      </w:pPr>
+      <w:r>
+        <w:t xml:space="preserve">First I will load in the packages need to clean data and run code.</w:t>
+      </w:r>
+      <w:r>
+        <w:t xml:space="preserve"> </w:t>
+      </w:r>
+      <w:r>
+        <w:t xml:space="preserve">-tidyverse</w:t>
+      </w:r>
+      <w:r>
+        <w:t xml:space="preserve"> </w:t>
+      </w:r>
+      <w:r>
+        <w:t xml:space="preserve">-readxl</w:t>
+      </w:r>
+      <w:r>
+        <w:t xml:space="preserve"> </w:t>
+      </w:r>
+      <w:r>
+        <w:t xml:space="preserve">-ggplot 2</w:t>
+      </w:r>
+      <w:r>
+        <w:t xml:space="preserve"> </w:t>
+      </w:r>
+      <w:r>
+        <w:t xml:space="preserve">-dply</w:t>
+      </w:r>
+    </w:p>
+    <w:p>
+      <w:pPr>
+        <w:numPr>
+          <w:ilvl w:val="0"/>
+          <w:numId w:val="1001"/>
+        </w:numPr>
+      </w:pPr>
+      <w:r>
+        <w:t xml:space="preserve">Next, I will import the dataset using readxl and save the dataset as an object title Emotions_Dogs. I will then inspect the data.</w:t>
+      </w:r>
+    </w:p>
+    <w:p>
+      <w:pPr>
+        <w:numPr>
+          <w:ilvl w:val="0"/>
+          <w:numId w:val="1001"/>
+        </w:numPr>
+      </w:pPr>
+      <w:r>
+        <w:t xml:space="preserve">Clean and tidy the dataset by removing the following columns.</w:t>
+      </w:r>
+    </w:p>
+    <w:p>
+      <w:pPr>
+        <w:pStyle w:val="Compact"/>
+        <w:numPr>
+          <w:ilvl w:val="0"/>
+          <w:numId w:val="1002"/>
+        </w:numPr>
+      </w:pPr>
+      <w:r>
+        <w:t xml:space="preserve">Trial</w:t>
+      </w:r>
+    </w:p>
+    <w:p>
+      <w:pPr>
+        <w:pStyle w:val="Compact"/>
+        <w:numPr>
+          <w:ilvl w:val="0"/>
+          <w:numId w:val="1002"/>
+        </w:numPr>
+      </w:pPr>
+      <w:r>
+        <w:t xml:space="preserve">Sequence</w:t>
+      </w:r>
+    </w:p>
+    <w:p>
+      <w:pPr>
+        <w:pStyle w:val="Compact"/>
+        <w:numPr>
+          <w:ilvl w:val="0"/>
+          <w:numId w:val="1002"/>
+        </w:numPr>
+      </w:pPr>
+      <w:r>
+        <w:t xml:space="preserve">Observer</w:t>
+      </w:r>
+    </w:p>
+    <w:p>
+      <w:pPr>
+        <w:pStyle w:val="Compact"/>
+        <w:numPr>
+          <w:ilvl w:val="0"/>
+          <w:numId w:val="1002"/>
+        </w:numPr>
+      </w:pPr>
+      <w:r>
+        <w:t xml:space="preserve">Notes</w:t>
+      </w:r>
+    </w:p>
+    <w:p>
+      <w:pPr>
+        <w:pStyle w:val="Compact"/>
+        <w:numPr>
+          <w:ilvl w:val="0"/>
+          <w:numId w:val="1002"/>
+        </w:numPr>
+      </w:pPr>
+      <w:r>
+        <w:t xml:space="preserve">Date</w:t>
+      </w:r>
+    </w:p>
+    <w:p>
+      <w:pPr>
+        <w:pStyle w:val="Compact"/>
+        <w:numPr>
+          <w:ilvl w:val="0"/>
+          <w:numId w:val="1002"/>
+        </w:numPr>
+      </w:pPr>
+      <w:r>
+        <w:t xml:space="preserve">Control</w:t>
+      </w:r>
+    </w:p>
+    <w:p>
+      <w:pPr>
+        <w:pStyle w:val="Compact"/>
+        <w:numPr>
+          <w:ilvl w:val="0"/>
+          <w:numId w:val="1002"/>
+        </w:numPr>
+      </w:pPr>
+      <w:r>
+        <w:t xml:space="preserve">Positive/Negative (Represent in Valence column)</w:t>
+      </w:r>
+      <w:r>
+        <w:t xml:space="preserve"> </w:t>
+      </w:r>
+      <w:r>
+        <w:t xml:space="preserve">I will keep the rest of the columns which will be used to create our digarams.</w:t>
+      </w:r>
+    </w:p>
+    <w:p>
+      <w:pPr>
+        <w:pStyle w:val="Compact"/>
+        <w:numPr>
+          <w:ilvl w:val="0"/>
+          <w:numId w:val="1003"/>
+        </w:numPr>
+      </w:pPr>
+      <w:r>
+        <w:t xml:space="preserve">I will check for missing values and remove any missing values.</w:t>
+      </w:r>
+    </w:p>
+    <w:p>
+      <w:pPr>
+        <w:pStyle w:val="Compact"/>
+        <w:numPr>
+          <w:ilvl w:val="0"/>
+          <w:numId w:val="1004"/>
+        </w:numPr>
+      </w:pPr>
+      <w:r>
+        <w:t xml:space="preserve">I will check side_con, matching and index columns.</w:t>
+      </w:r>
+    </w:p>
+    <w:p>
+      <w:pPr>
+        <w:pStyle w:val="Compact"/>
+        <w:numPr>
+          <w:ilvl w:val="0"/>
+          <w:numId w:val="1004"/>
+        </w:numPr>
+      </w:pPr>
+      <w:r>
+        <w:t xml:space="preserve">I will convert columns in factors to make the data cleaner.</w:t>
+      </w:r>
+    </w:p>
+    <w:p>
+      <w:pPr>
+        <w:pStyle w:val="Compact"/>
+        <w:numPr>
+          <w:ilvl w:val="0"/>
+          <w:numId w:val="1005"/>
+        </w:numPr>
+      </w:pPr>
+      <w:r>
+        <w:t xml:space="preserve">Create new variables</w:t>
+      </w:r>
+    </w:p>
+    <w:p>
+      <w:pPr>
+        <w:pStyle w:val="Compact"/>
+        <w:numPr>
+          <w:ilvl w:val="0"/>
+          <w:numId w:val="1006"/>
+        </w:numPr>
+      </w:pPr>
+      <w:r>
+        <w:t xml:space="preserve">I will create a new column with left and right interaction time together for a cleaner data set.</w:t>
+      </w:r>
+    </w:p>
+    <w:p>
+      <w:pPr>
+        <w:pStyle w:val="Compact"/>
+        <w:numPr>
+          <w:ilvl w:val="0"/>
+          <w:numId w:val="1006"/>
+        </w:numPr>
+      </w:pPr>
+      <w:r>
+        <w:t xml:space="preserve">I will also create abs_index variable to see the strength of the response.</w:t>
+      </w:r>
+    </w:p>
+    <w:p>
+      <w:pPr>
+        <w:pStyle w:val="Compact"/>
+        <w:numPr>
+          <w:ilvl w:val="0"/>
+          <w:numId w:val="1007"/>
+        </w:numPr>
+      </w:pPr>
+      <w:r>
+        <w:t xml:space="preserve">Next I will test the differences by comparing</w:t>
+      </w:r>
+    </w:p>
+    <w:p>
+      <w:pPr>
+        <w:pStyle w:val="Compact"/>
+        <w:numPr>
+          <w:ilvl w:val="0"/>
+          <w:numId w:val="1008"/>
+        </w:numPr>
+      </w:pPr>
+      <w:r>
+        <w:t xml:space="preserve">mean valence</w:t>
+      </w:r>
+    </w:p>
+    <w:p>
+      <w:pPr>
+        <w:pStyle w:val="Compact"/>
+        <w:numPr>
+          <w:ilvl w:val="0"/>
+          <w:numId w:val="1008"/>
+        </w:numPr>
+      </w:pPr>
+      <w:r>
+        <w:t xml:space="preserve">mean index</w:t>
+      </w:r>
+    </w:p>
+    <w:p>
+      <w:pPr>
+        <w:pStyle w:val="Compact"/>
+        <w:numPr>
+          <w:ilvl w:val="0"/>
+          <w:numId w:val="1008"/>
+        </w:numPr>
+      </w:pPr>
+      <w:r>
+        <w:t xml:space="preserve">mean total_ time</w:t>
+      </w:r>
+    </w:p>
+    <w:p>
+      <w:pPr>
+        <w:pStyle w:val="Compact"/>
+        <w:numPr>
+          <w:ilvl w:val="0"/>
+          <w:numId w:val="1009"/>
+        </w:numPr>
+      </w:pPr>
+      <w:r>
+        <w:t xml:space="preserve">Lastly I will create figures to answers the questions in project overview section.</w:t>
       </w:r>
     </w:p>
     <w:sectPr>
@@ -272,8 +559,698 @@
       </w:pPr>
     </w:lvl>
   </w:abstractNum>
+  <w:abstractNum w:abstractNumId="99411">
+    <w:nsid w:val="00A99411"/>
+    <w:multiLevelType w:val="multilevel"/>
+    <w:lvl w:ilvl="0">
+      <w:start w:val="1"/>
+      <w:numFmt w:val="decimal"/>
+      <w:lvlText w:val="%1."/>
+      <w:lvlJc w:val="left"/>
+      <w:pPr>
+        <w:ind w:left="720" w:hanging="360"/>
+      </w:pPr>
+    </w:lvl>
+    <w:lvl w:ilvl="1">
+      <w:start w:val="1"/>
+      <w:numFmt w:val="decimal"/>
+      <w:lvlText w:val="%2."/>
+      <w:lvlJc w:val="left"/>
+      <w:pPr>
+        <w:ind w:left="1440" w:hanging="360"/>
+      </w:pPr>
+    </w:lvl>
+    <w:lvl w:ilvl="2">
+      <w:start w:val="1"/>
+      <w:numFmt w:val="decimal"/>
+      <w:lvlText w:val="%3."/>
+      <w:lvlJc w:val="left"/>
+      <w:pPr>
+        <w:ind w:left="2160" w:hanging="360"/>
+      </w:pPr>
+    </w:lvl>
+    <w:lvl w:ilvl="3">
+      <w:start w:val="1"/>
+      <w:numFmt w:val="decimal"/>
+      <w:lvlText w:val="%4."/>
+      <w:lvlJc w:val="left"/>
+      <w:pPr>
+        <w:ind w:left="2880" w:hanging="360"/>
+      </w:pPr>
+    </w:lvl>
+    <w:lvl w:ilvl="4">
+      <w:start w:val="1"/>
+      <w:numFmt w:val="decimal"/>
+      <w:lvlText w:val="%5."/>
+      <w:lvlJc w:val="left"/>
+      <w:pPr>
+        <w:ind w:left="3600" w:hanging="360"/>
+      </w:pPr>
+    </w:lvl>
+    <w:lvl w:ilvl="5">
+      <w:start w:val="1"/>
+      <w:numFmt w:val="decimal"/>
+      <w:lvlText w:val="%6."/>
+      <w:lvlJc w:val="left"/>
+      <w:pPr>
+        <w:ind w:left="4320" w:hanging="360"/>
+      </w:pPr>
+    </w:lvl>
+    <w:lvl w:ilvl="6">
+      <w:start w:val="1"/>
+      <w:numFmt w:val="decimal"/>
+      <w:lvlText w:val="%7."/>
+      <w:lvlJc w:val="left"/>
+      <w:pPr>
+        <w:ind w:left="5040" w:hanging="360"/>
+      </w:pPr>
+    </w:lvl>
+    <w:lvl w:ilvl="7">
+      <w:start w:val="1"/>
+      <w:numFmt w:val="decimal"/>
+      <w:lvlText w:val="%8."/>
+      <w:lvlJc w:val="left"/>
+      <w:pPr>
+        <w:ind w:left="5760" w:hanging="360"/>
+      </w:pPr>
+    </w:lvl>
+    <w:lvl w:ilvl="8">
+      <w:start w:val="1"/>
+      <w:numFmt w:val="decimal"/>
+      <w:lvlText w:val="%9."/>
+      <w:lvlJc w:val="left"/>
+      <w:pPr>
+        <w:ind w:left="6480" w:hanging="360"/>
+      </w:pPr>
+    </w:lvl>
+  </w:abstractNum>
+  <w:abstractNum w:abstractNumId="991">
+    <w:nsid w:val="0000A991"/>
+    <w:multiLevelType w:val="multilevel"/>
+    <w:lvl w:ilvl="0">
+      <w:numFmt w:val="bullet"/>
+      <w:lvlText w:val=""/>
+      <w:lvlJc w:val="left"/>
+      <w:pPr>
+        <w:ind w:left="720" w:hanging="360"/>
+      </w:pPr>
+      <w:rPr>
+        <w:rFonts w:ascii="Symbol" w:hAnsi="Symbol" w:cs="Symbol" w:hint="default"/>
+      </w:rPr>
+    </w:lvl>
+    <w:lvl w:ilvl="1">
+      <w:numFmt w:val="bullet"/>
+      <w:lvlText w:val="o"/>
+      <w:lvlJc w:val="left"/>
+      <w:pPr>
+        <w:ind w:left="1440" w:hanging="360"/>
+      </w:pPr>
+      <w:rPr>
+        <w:rFonts w:ascii="Courier New" w:hAnsi="Courier New" w:cs="Courier New" w:hint="default"/>
+      </w:rPr>
+    </w:lvl>
+    <w:lvl w:ilvl="2">
+      <w:numFmt w:val="bullet"/>
+      <w:lvlText w:val=""/>
+      <w:lvlJc w:val="left"/>
+      <w:pPr>
+        <w:ind w:left="2160" w:hanging="360"/>
+      </w:pPr>
+      <w:rPr>
+        <w:rFonts w:ascii="Wingdings" w:hAnsi="Wingdings" w:cs="Wingdings" w:hint="default"/>
+      </w:rPr>
+    </w:lvl>
+    <w:lvl w:ilvl="3">
+      <w:numFmt w:val="bullet"/>
+      <w:lvlText w:val=""/>
+      <w:lvlJc w:val="left"/>
+      <w:pPr>
+        <w:ind w:left="2880" w:hanging="360"/>
+      </w:pPr>
+      <w:rPr>
+        <w:rFonts w:ascii="Symbol" w:hAnsi="Symbol" w:cs="Symbol" w:hint="default"/>
+      </w:rPr>
+    </w:lvl>
+    <w:lvl w:ilvl="4">
+      <w:numFmt w:val="bullet"/>
+      <w:lvlText w:val="o"/>
+      <w:lvlJc w:val="left"/>
+      <w:pPr>
+        <w:ind w:left="3600" w:hanging="360"/>
+      </w:pPr>
+      <w:rPr>
+        <w:rFonts w:ascii="Courier New" w:hAnsi="Courier New" w:cs="Courier New" w:hint="default"/>
+      </w:rPr>
+    </w:lvl>
+    <w:lvl w:ilvl="5">
+      <w:numFmt w:val="bullet"/>
+      <w:lvlText w:val=""/>
+      <w:lvlJc w:val="left"/>
+      <w:pPr>
+        <w:ind w:left="4320" w:hanging="360"/>
+      </w:pPr>
+      <w:rPr>
+        <w:rFonts w:ascii="Wingdings" w:hAnsi="Wingdings" w:cs="Wingdings" w:hint="default"/>
+      </w:rPr>
+    </w:lvl>
+    <w:lvl w:ilvl="6">
+      <w:numFmt w:val="bullet"/>
+      <w:lvlText w:val=""/>
+      <w:lvlJc w:val="left"/>
+      <w:pPr>
+        <w:ind w:left="5040" w:hanging="360"/>
+      </w:pPr>
+      <w:rPr>
+        <w:rFonts w:ascii="Symbol" w:hAnsi="Symbol" w:cs="Symbol" w:hint="default"/>
+      </w:rPr>
+    </w:lvl>
+    <w:lvl w:ilvl="7">
+      <w:numFmt w:val="bullet"/>
+      <w:lvlText w:val="o"/>
+      <w:lvlJc w:val="left"/>
+      <w:pPr>
+        <w:ind w:left="5760" w:hanging="360"/>
+      </w:pPr>
+      <w:rPr>
+        <w:rFonts w:ascii="Courier New" w:hAnsi="Courier New" w:cs="Courier New" w:hint="default"/>
+      </w:rPr>
+    </w:lvl>
+    <w:lvl w:ilvl="8">
+      <w:numFmt w:val="bullet"/>
+      <w:lvlText w:val=""/>
+      <w:lvlJc w:val="left"/>
+      <w:pPr>
+        <w:ind w:left="6480" w:hanging="360"/>
+      </w:pPr>
+      <w:rPr>
+        <w:rFonts w:ascii="Wingdings" w:hAnsi="Wingdings" w:cs="Wingdings" w:hint="default"/>
+      </w:rPr>
+    </w:lvl>
+  </w:abstractNum>
+  <w:abstractNum w:abstractNumId="99414">
+    <w:nsid w:val="00A99414"/>
+    <w:multiLevelType w:val="multilevel"/>
+    <w:lvl w:ilvl="0">
+      <w:start w:val="4"/>
+      <w:numFmt w:val="decimal"/>
+      <w:lvlText w:val="%1."/>
+      <w:lvlJc w:val="left"/>
+      <w:pPr>
+        <w:ind w:left="720" w:hanging="360"/>
+      </w:pPr>
+    </w:lvl>
+    <w:lvl w:ilvl="1">
+      <w:start w:val="4"/>
+      <w:numFmt w:val="decimal"/>
+      <w:lvlText w:val="%2."/>
+      <w:lvlJc w:val="left"/>
+      <w:pPr>
+        <w:ind w:left="1440" w:hanging="360"/>
+      </w:pPr>
+    </w:lvl>
+    <w:lvl w:ilvl="2">
+      <w:start w:val="4"/>
+      <w:numFmt w:val="decimal"/>
+      <w:lvlText w:val="%3."/>
+      <w:lvlJc w:val="left"/>
+      <w:pPr>
+        <w:ind w:left="2160" w:hanging="360"/>
+      </w:pPr>
+    </w:lvl>
+    <w:lvl w:ilvl="3">
+      <w:start w:val="4"/>
+      <w:numFmt w:val="decimal"/>
+      <w:lvlText w:val="%4."/>
+      <w:lvlJc w:val="left"/>
+      <w:pPr>
+        <w:ind w:left="2880" w:hanging="360"/>
+      </w:pPr>
+    </w:lvl>
+    <w:lvl w:ilvl="4">
+      <w:start w:val="4"/>
+      <w:numFmt w:val="decimal"/>
+      <w:lvlText w:val="%5."/>
+      <w:lvlJc w:val="left"/>
+      <w:pPr>
+        <w:ind w:left="3600" w:hanging="360"/>
+      </w:pPr>
+    </w:lvl>
+    <w:lvl w:ilvl="5">
+      <w:start w:val="4"/>
+      <w:numFmt w:val="decimal"/>
+      <w:lvlText w:val="%6."/>
+      <w:lvlJc w:val="left"/>
+      <w:pPr>
+        <w:ind w:left="4320" w:hanging="360"/>
+      </w:pPr>
+    </w:lvl>
+    <w:lvl w:ilvl="6">
+      <w:start w:val="4"/>
+      <w:numFmt w:val="decimal"/>
+      <w:lvlText w:val="%7."/>
+      <w:lvlJc w:val="left"/>
+      <w:pPr>
+        <w:ind w:left="5040" w:hanging="360"/>
+      </w:pPr>
+    </w:lvl>
+    <w:lvl w:ilvl="7">
+      <w:start w:val="4"/>
+      <w:numFmt w:val="decimal"/>
+      <w:lvlText w:val="%8."/>
+      <w:lvlJc w:val="left"/>
+      <w:pPr>
+        <w:ind w:left="5760" w:hanging="360"/>
+      </w:pPr>
+    </w:lvl>
+    <w:lvl w:ilvl="8">
+      <w:start w:val="4"/>
+      <w:numFmt w:val="decimal"/>
+      <w:lvlText w:val="%9."/>
+      <w:lvlJc w:val="left"/>
+      <w:pPr>
+        <w:ind w:left="6480" w:hanging="360"/>
+      </w:pPr>
+    </w:lvl>
+  </w:abstractNum>
+  <w:abstractNum w:abstractNumId="99415">
+    <w:nsid w:val="00A99415"/>
+    <w:multiLevelType w:val="multilevel"/>
+    <w:lvl w:ilvl="0">
+      <w:start w:val="5"/>
+      <w:numFmt w:val="decimal"/>
+      <w:lvlText w:val="%1."/>
+      <w:lvlJc w:val="left"/>
+      <w:pPr>
+        <w:ind w:left="720" w:hanging="360"/>
+      </w:pPr>
+    </w:lvl>
+    <w:lvl w:ilvl="1">
+      <w:start w:val="5"/>
+      <w:numFmt w:val="decimal"/>
+      <w:lvlText w:val="%2."/>
+      <w:lvlJc w:val="left"/>
+      <w:pPr>
+        <w:ind w:left="1440" w:hanging="360"/>
+      </w:pPr>
+    </w:lvl>
+    <w:lvl w:ilvl="2">
+      <w:start w:val="5"/>
+      <w:numFmt w:val="decimal"/>
+      <w:lvlText w:val="%3."/>
+      <w:lvlJc w:val="left"/>
+      <w:pPr>
+        <w:ind w:left="2160" w:hanging="360"/>
+      </w:pPr>
+    </w:lvl>
+    <w:lvl w:ilvl="3">
+      <w:start w:val="5"/>
+      <w:numFmt w:val="decimal"/>
+      <w:lvlText w:val="%4."/>
+      <w:lvlJc w:val="left"/>
+      <w:pPr>
+        <w:ind w:left="2880" w:hanging="360"/>
+      </w:pPr>
+    </w:lvl>
+    <w:lvl w:ilvl="4">
+      <w:start w:val="5"/>
+      <w:numFmt w:val="decimal"/>
+      <w:lvlText w:val="%5."/>
+      <w:lvlJc w:val="left"/>
+      <w:pPr>
+        <w:ind w:left="3600" w:hanging="360"/>
+      </w:pPr>
+    </w:lvl>
+    <w:lvl w:ilvl="5">
+      <w:start w:val="5"/>
+      <w:numFmt w:val="decimal"/>
+      <w:lvlText w:val="%6."/>
+      <w:lvlJc w:val="left"/>
+      <w:pPr>
+        <w:ind w:left="4320" w:hanging="360"/>
+      </w:pPr>
+    </w:lvl>
+    <w:lvl w:ilvl="6">
+      <w:start w:val="5"/>
+      <w:numFmt w:val="decimal"/>
+      <w:lvlText w:val="%7."/>
+      <w:lvlJc w:val="left"/>
+      <w:pPr>
+        <w:ind w:left="5040" w:hanging="360"/>
+      </w:pPr>
+    </w:lvl>
+    <w:lvl w:ilvl="7">
+      <w:start w:val="5"/>
+      <w:numFmt w:val="decimal"/>
+      <w:lvlText w:val="%8."/>
+      <w:lvlJc w:val="left"/>
+      <w:pPr>
+        <w:ind w:left="5760" w:hanging="360"/>
+      </w:pPr>
+    </w:lvl>
+    <w:lvl w:ilvl="8">
+      <w:start w:val="5"/>
+      <w:numFmt w:val="decimal"/>
+      <w:lvlText w:val="%9."/>
+      <w:lvlJc w:val="left"/>
+      <w:pPr>
+        <w:ind w:left="6480" w:hanging="360"/>
+      </w:pPr>
+    </w:lvl>
+  </w:abstractNum>
+  <w:abstractNum w:abstractNumId="99416">
+    <w:nsid w:val="00A99416"/>
+    <w:multiLevelType w:val="multilevel"/>
+    <w:lvl w:ilvl="0">
+      <w:start w:val="6"/>
+      <w:numFmt w:val="decimal"/>
+      <w:lvlText w:val="%1."/>
+      <w:lvlJc w:val="left"/>
+      <w:pPr>
+        <w:ind w:left="720" w:hanging="360"/>
+      </w:pPr>
+    </w:lvl>
+    <w:lvl w:ilvl="1">
+      <w:start w:val="6"/>
+      <w:numFmt w:val="decimal"/>
+      <w:lvlText w:val="%2."/>
+      <w:lvlJc w:val="left"/>
+      <w:pPr>
+        <w:ind w:left="1440" w:hanging="360"/>
+      </w:pPr>
+    </w:lvl>
+    <w:lvl w:ilvl="2">
+      <w:start w:val="6"/>
+      <w:numFmt w:val="decimal"/>
+      <w:lvlText w:val="%3."/>
+      <w:lvlJc w:val="left"/>
+      <w:pPr>
+        <w:ind w:left="2160" w:hanging="360"/>
+      </w:pPr>
+    </w:lvl>
+    <w:lvl w:ilvl="3">
+      <w:start w:val="6"/>
+      <w:numFmt w:val="decimal"/>
+      <w:lvlText w:val="%4."/>
+      <w:lvlJc w:val="left"/>
+      <w:pPr>
+        <w:ind w:left="2880" w:hanging="360"/>
+      </w:pPr>
+    </w:lvl>
+    <w:lvl w:ilvl="4">
+      <w:start w:val="6"/>
+      <w:numFmt w:val="decimal"/>
+      <w:lvlText w:val="%5."/>
+      <w:lvlJc w:val="left"/>
+      <w:pPr>
+        <w:ind w:left="3600" w:hanging="360"/>
+      </w:pPr>
+    </w:lvl>
+    <w:lvl w:ilvl="5">
+      <w:start w:val="6"/>
+      <w:numFmt w:val="decimal"/>
+      <w:lvlText w:val="%6."/>
+      <w:lvlJc w:val="left"/>
+      <w:pPr>
+        <w:ind w:left="4320" w:hanging="360"/>
+      </w:pPr>
+    </w:lvl>
+    <w:lvl w:ilvl="6">
+      <w:start w:val="6"/>
+      <w:numFmt w:val="decimal"/>
+      <w:lvlText w:val="%7."/>
+      <w:lvlJc w:val="left"/>
+      <w:pPr>
+        <w:ind w:left="5040" w:hanging="360"/>
+      </w:pPr>
+    </w:lvl>
+    <w:lvl w:ilvl="7">
+      <w:start w:val="6"/>
+      <w:numFmt w:val="decimal"/>
+      <w:lvlText w:val="%8."/>
+      <w:lvlJc w:val="left"/>
+      <w:pPr>
+        <w:ind w:left="5760" w:hanging="360"/>
+      </w:pPr>
+    </w:lvl>
+    <w:lvl w:ilvl="8">
+      <w:start w:val="6"/>
+      <w:numFmt w:val="decimal"/>
+      <w:lvlText w:val="%9."/>
+      <w:lvlJc w:val="left"/>
+      <w:pPr>
+        <w:ind w:left="6480" w:hanging="360"/>
+      </w:pPr>
+    </w:lvl>
+  </w:abstractNum>
+  <w:abstractNum w:abstractNumId="99417">
+    <w:nsid w:val="00A99417"/>
+    <w:multiLevelType w:val="multilevel"/>
+    <w:lvl w:ilvl="0">
+      <w:start w:val="7"/>
+      <w:numFmt w:val="decimal"/>
+      <w:lvlText w:val="%1."/>
+      <w:lvlJc w:val="left"/>
+      <w:pPr>
+        <w:ind w:left="720" w:hanging="360"/>
+      </w:pPr>
+    </w:lvl>
+    <w:lvl w:ilvl="1">
+      <w:start w:val="7"/>
+      <w:numFmt w:val="decimal"/>
+      <w:lvlText w:val="%2."/>
+      <w:lvlJc w:val="left"/>
+      <w:pPr>
+        <w:ind w:left="1440" w:hanging="360"/>
+      </w:pPr>
+    </w:lvl>
+    <w:lvl w:ilvl="2">
+      <w:start w:val="7"/>
+      <w:numFmt w:val="decimal"/>
+      <w:lvlText w:val="%3."/>
+      <w:lvlJc w:val="left"/>
+      <w:pPr>
+        <w:ind w:left="2160" w:hanging="360"/>
+      </w:pPr>
+    </w:lvl>
+    <w:lvl w:ilvl="3">
+      <w:start w:val="7"/>
+      <w:numFmt w:val="decimal"/>
+      <w:lvlText w:val="%4."/>
+      <w:lvlJc w:val="left"/>
+      <w:pPr>
+        <w:ind w:left="2880" w:hanging="360"/>
+      </w:pPr>
+    </w:lvl>
+    <w:lvl w:ilvl="4">
+      <w:start w:val="7"/>
+      <w:numFmt w:val="decimal"/>
+      <w:lvlText w:val="%5."/>
+      <w:lvlJc w:val="left"/>
+      <w:pPr>
+        <w:ind w:left="3600" w:hanging="360"/>
+      </w:pPr>
+    </w:lvl>
+    <w:lvl w:ilvl="5">
+      <w:start w:val="7"/>
+      <w:numFmt w:val="decimal"/>
+      <w:lvlText w:val="%6."/>
+      <w:lvlJc w:val="left"/>
+      <w:pPr>
+        <w:ind w:left="4320" w:hanging="360"/>
+      </w:pPr>
+    </w:lvl>
+    <w:lvl w:ilvl="6">
+      <w:start w:val="7"/>
+      <w:numFmt w:val="decimal"/>
+      <w:lvlText w:val="%7."/>
+      <w:lvlJc w:val="left"/>
+      <w:pPr>
+        <w:ind w:left="5040" w:hanging="360"/>
+      </w:pPr>
+    </w:lvl>
+    <w:lvl w:ilvl="7">
+      <w:start w:val="7"/>
+      <w:numFmt w:val="decimal"/>
+      <w:lvlText w:val="%8."/>
+      <w:lvlJc w:val="left"/>
+      <w:pPr>
+        <w:ind w:left="5760" w:hanging="360"/>
+      </w:pPr>
+    </w:lvl>
+    <w:lvl w:ilvl="8">
+      <w:start w:val="7"/>
+      <w:numFmt w:val="decimal"/>
+      <w:lvlText w:val="%9."/>
+      <w:lvlJc w:val="left"/>
+      <w:pPr>
+        <w:ind w:left="6480" w:hanging="360"/>
+      </w:pPr>
+    </w:lvl>
+  </w:abstractNum>
   <w:num w:numId="1000">
     <w:abstractNumId w:val="990"/>
+  </w:num>
+  <w:num w:numId="1001">
+    <w:abstractNumId w:val="99411"/>
+    <w:lvlOverride w:ilvl="0">
+      <w:startOverride w:val="1"/>
+    </w:lvlOverride>
+    <w:lvlOverride w:ilvl="1">
+      <w:startOverride w:val="1"/>
+    </w:lvlOverride>
+    <w:lvlOverride w:ilvl="2">
+      <w:startOverride w:val="1"/>
+    </w:lvlOverride>
+    <w:lvlOverride w:ilvl="3">
+      <w:startOverride w:val="1"/>
+    </w:lvlOverride>
+    <w:lvlOverride w:ilvl="4">
+      <w:startOverride w:val="1"/>
+    </w:lvlOverride>
+    <w:lvlOverride w:ilvl="5">
+      <w:startOverride w:val="1"/>
+    </w:lvlOverride>
+    <w:lvlOverride w:ilvl="6">
+      <w:startOverride w:val="1"/>
+    </w:lvlOverride>
+    <w:lvlOverride w:ilvl="7">
+      <w:startOverride w:val="1"/>
+    </w:lvlOverride>
+    <w:lvlOverride w:ilvl="8">
+      <w:startOverride w:val="1"/>
+    </w:lvlOverride>
+  </w:num>
+  <w:num w:numId="1002">
+    <w:abstractNumId w:val="991"/>
+  </w:num>
+  <w:num w:numId="1003">
+    <w:abstractNumId w:val="99414"/>
+    <w:lvlOverride w:ilvl="0">
+      <w:startOverride w:val="4"/>
+    </w:lvlOverride>
+    <w:lvlOverride w:ilvl="1">
+      <w:startOverride w:val="4"/>
+    </w:lvlOverride>
+    <w:lvlOverride w:ilvl="2">
+      <w:startOverride w:val="4"/>
+    </w:lvlOverride>
+    <w:lvlOverride w:ilvl="3">
+      <w:startOverride w:val="4"/>
+    </w:lvlOverride>
+    <w:lvlOverride w:ilvl="4">
+      <w:startOverride w:val="4"/>
+    </w:lvlOverride>
+    <w:lvlOverride w:ilvl="5">
+      <w:startOverride w:val="4"/>
+    </w:lvlOverride>
+    <w:lvlOverride w:ilvl="6">
+      <w:startOverride w:val="4"/>
+    </w:lvlOverride>
+    <w:lvlOverride w:ilvl="7">
+      <w:startOverride w:val="4"/>
+    </w:lvlOverride>
+    <w:lvlOverride w:ilvl="8">
+      <w:startOverride w:val="4"/>
+    </w:lvlOverride>
+  </w:num>
+  <w:num w:numId="1004">
+    <w:abstractNumId w:val="991"/>
+  </w:num>
+  <w:num w:numId="1005">
+    <w:abstractNumId w:val="99415"/>
+    <w:lvlOverride w:ilvl="0">
+      <w:startOverride w:val="5"/>
+    </w:lvlOverride>
+    <w:lvlOverride w:ilvl="1">
+      <w:startOverride w:val="5"/>
+    </w:lvlOverride>
+    <w:lvlOverride w:ilvl="2">
+      <w:startOverride w:val="5"/>
+    </w:lvlOverride>
+    <w:lvlOverride w:ilvl="3">
+      <w:startOverride w:val="5"/>
+    </w:lvlOverride>
+    <w:lvlOverride w:ilvl="4">
+      <w:startOverride w:val="5"/>
+    </w:lvlOverride>
+    <w:lvlOverride w:ilvl="5">
+      <w:startOverride w:val="5"/>
+    </w:lvlOverride>
+    <w:lvlOverride w:ilvl="6">
+      <w:startOverride w:val="5"/>
+    </w:lvlOverride>
+    <w:lvlOverride w:ilvl="7">
+      <w:startOverride w:val="5"/>
+    </w:lvlOverride>
+    <w:lvlOverride w:ilvl="8">
+      <w:startOverride w:val="5"/>
+    </w:lvlOverride>
+  </w:num>
+  <w:num w:numId="1006">
+    <w:abstractNumId w:val="991"/>
+  </w:num>
+  <w:num w:numId="1007">
+    <w:abstractNumId w:val="99416"/>
+    <w:lvlOverride w:ilvl="0">
+      <w:startOverride w:val="6"/>
+    </w:lvlOverride>
+    <w:lvlOverride w:ilvl="1">
+      <w:startOverride w:val="6"/>
+    </w:lvlOverride>
+    <w:lvlOverride w:ilvl="2">
+      <w:startOverride w:val="6"/>
+    </w:lvlOverride>
+    <w:lvlOverride w:ilvl="3">
+      <w:startOverride w:val="6"/>
+    </w:lvlOverride>
+    <w:lvlOverride w:ilvl="4">
+      <w:startOverride w:val="6"/>
+    </w:lvlOverride>
+    <w:lvlOverride w:ilvl="5">
+      <w:startOverride w:val="6"/>
+    </w:lvlOverride>
+    <w:lvlOverride w:ilvl="6">
+      <w:startOverride w:val="6"/>
+    </w:lvlOverride>
+    <w:lvlOverride w:ilvl="7">
+      <w:startOverride w:val="6"/>
+    </w:lvlOverride>
+    <w:lvlOverride w:ilvl="8">
+      <w:startOverride w:val="6"/>
+    </w:lvlOverride>
+  </w:num>
+  <w:num w:numId="1008">
+    <w:abstractNumId w:val="991"/>
+  </w:num>
+  <w:num w:numId="1009">
+    <w:abstractNumId w:val="99417"/>
+    <w:lvlOverride w:ilvl="0">
+      <w:startOverride w:val="7"/>
+    </w:lvlOverride>
+    <w:lvlOverride w:ilvl="1">
+      <w:startOverride w:val="7"/>
+    </w:lvlOverride>
+    <w:lvlOverride w:ilvl="2">
+      <w:startOverride w:val="7"/>
+    </w:lvlOverride>
+    <w:lvlOverride w:ilvl="3">
+      <w:startOverride w:val="7"/>
+    </w:lvlOverride>
+    <w:lvlOverride w:ilvl="4">
+      <w:startOverride w:val="7"/>
+    </w:lvlOverride>
+    <w:lvlOverride w:ilvl="5">
+      <w:startOverride w:val="7"/>
+    </w:lvlOverride>
+    <w:lvlOverride w:ilvl="6">
+      <w:startOverride w:val="7"/>
+    </w:lvlOverride>
+    <w:lvlOverride w:ilvl="7">
+      <w:startOverride w:val="7"/>
+    </w:lvlOverride>
+    <w:lvlOverride w:ilvl="8">
+      <w:startOverride w:val="7"/>
+    </w:lvlOverride>
   </w:num>
 </w:numbering>
 </file>

</xml_diff>